<commit_message>
handoff + index: campaign capture complete, all 19 workflows
94 touches, 83 corrections. Every live email and SMS in the GHL account now
exists in the repo with a per-workflow change log. Closes the gap that produced
Standing Rule 9.

Recorded the three systemic findings so a future session does not relearn them:
corrections declared fixed were not fixed everywhere (the accreditation gate
survived three declared fixes, the guarantee coupling six instances across four
workflows), A/B workflows need both arms checked, and the most valuable finds
were silent failures that nothing in GHL reports.

Also flagged WF-20 touch 3C as not a duplicate. It is a held send for contacts
outside both seasonal windows and was misread during capture.

Co-Authored-By: Claude Opus 5 <noreply@anthropic.com>
</commit_message>
<xml_diff>
--- a/campaigns/_INDEX.docx
+++ b/campaigns/_INDEX.docx
@@ -13,6 +13,14 @@
     </w:p>
     <w:tbl>
       <w:tblPr>
+        <w:tblBorders>
+          <w:top w:val="single" w:sz="6" w:space="0" w:color="AAAAAA"/>
+          <w:left w:val="single" w:sz="6" w:space="0" w:color="AAAAAA"/>
+          <w:bottom w:val="single" w:sz="6" w:space="0" w:color="AAAAAA"/>
+          <w:right w:val="single" w:sz="6" w:space="0" w:color="AAAAAA"/>
+          <w:insideH w:val="single" w:sz="6" w:space="0" w:color="AAAAAA"/>
+          <w:insideV w:val="single" w:sz="6" w:space="0" w:color="AAAAAA"/>
+        </w:tblBorders>
         <w:tblStyle w:val="Table"/>
         <w:tblW w:type="pct" w:w="5000"/>
         <w:tblLayout w:type="fixed"/>
@@ -733,6 +741,32 @@
       </w:pPr>
       <w:r>
         <w:t xml:space="preserve">Priority order: the five drips first (highest volume and most compliance-audited), then magnet nurtures, then transactional.</w:t>
+      </w:r>
+    </w:p>
+    <w:p>
+      <w:pPr>
+        <w:pStyle w:val="BodyText"/>
+      </w:pPr>
+      <w:r>
+        <w:rPr>
+          <w:b/>
+          <w:bCs/>
+        </w:rPr>
+        <w:t xml:space="preserve">COMPLETE, Aug 3, 2026.</w:t>
+      </w:r>
+      <w:r>
+        <w:t xml:space="preserve"> </w:t>
+      </w:r>
+      <w:r>
+        <w:t xml:space="preserve">19 workflows, 94 touches, 83 corrections applied. Every live email and SMS in the GHL account is captured.</w:t>
+      </w:r>
+    </w:p>
+    <w:p>
+      <w:pPr>
+        <w:pStyle w:val="BodyText"/>
+      </w:pPr>
+      <w:r>
+        <w:t xml:space="preserve">GHL is the source of truth. Change GHL first, then update the file. If a correction is applied in one workflow, grep the rest before calling it done, the accreditation gate and the guarantee coupling each survived being declared fixed.</w:t>
       </w:r>
     </w:p>
     <w:bookmarkEnd w:id="9"/>

</xml_diff>